<commit_message>
Langgutachten fallspezifisch: Holzofen, HGB Altona, Lobbyregister, Private Equity
Co-Authored-By: Claude Fable 5 <noreply@anthropic.com>
Claude-Session: https://claude.ai/code/session_01YXnmkjavncPDoNYycYaC5G
</commit_message>
<xml_diff>
--- a/testakten/bgb-bt-holzofen-lieferkette-buergschaft-goa-delikt/14-langgutachten-und-entscheidungsvorlage.docx
+++ b/testakten/bgb-bt-holzofen-lieferkette-buergschaft-goa-delikt/14-langgutachten-und-entscheidungsvorlage.docx
@@ -29,16 +29,7 @@
         <w:jc w:val="left"/>
       </w:pPr>
       <w:r>
-        <w:t xml:space="preserve">Dieses Aktenstück fasst die bisherigen Unterlagen zum Vorgang </w:t>
-      </w:r>
-      <w:r>
-        <w:rPr>
-          <w:b/>
-        </w:rPr>
-        <w:t>Holzofen Falkenried</w:t>
-      </w:r>
-      <w:r>
-        <w:t xml:space="preserve"> nicht bloß zusammen, sondern arbeitet die entscheidungsfähige Prüfungsfassung aus. Die Akte ist in der bisherigen Form fragmentarisch: Einzelne Mails sind zu knapp, Tabellen enthalten nur Stichworte, und manche Anlagen nennen ein Problem, ohne den rechtlichen Gedankengang auszuführen. Dieses Langgutachten schließt diese Lücke.</w:t>
+        <w:t>Dieses Aktenstück führt die Unterlagen im Mandat Windmöller gegen Ofenhaus Backstein GmbH zu einer entscheidungsfähigen Prüfungsfassung zusammen. Gegenstand ist der wasserführende Holzofen Aquaflamm 8 kW, den die Mandantin Klara Windmöller auf das Angebot Nr. 25-1188 vom 14.10.2025 hin am 18.10.2025 für ihren Altbau in Lübeck bestellte und den der Monteur Hinnerk Brandt am 21.11.2025 einbaute. Die Akte ist fragmentarisch: Die Mängel-E-Mail vom 03.12.2025 ist knapp, das Montageprotokoll trägt eine unleserliche Unterschrift, und die Regressankündigung der Provinzial Nord nennt nur Prüfpunkte, ohne den rechtlichen Gedankengang auszuführen. Dieses Langgutachten schließt diese Lücken.</w:t>
       </w:r>
     </w:p>
     <w:p>
@@ -57,7 +48,7 @@
         <w:jc w:val="left"/>
       </w:pPr>
       <w:r>
-        <w:t>Der Fall wird entlang folgender Themen bearbeitet: Kauf/Werkvertrag, Lieferkette, Bürgschaft, Ersatzvornahme, GoA, Brand-/Deliktsschaden und Regress. Für jedes Thema wird getrennt gefragt, ob es bereits entscheidungsreif ist, ob weitere Tatsachen fehlen oder ob zunächst nur ein Risikovermerk möglich ist.</w:t>
+        <w:t>Der Fall wird entlang folgender Themen bearbeitet: Vertragstyp des Geschäfts über Lieferung und Montage des Aquaflamm 8 kW (Kauf mit Montageverpflichtung oder Werkvertrag), Verantwortlichkeit in der Kette aus Ofenhaus Backstein GmbH und Monteur Brandt, Bürgschaft der Bankhaus Nordtor eG über höchstens 4.000 EUR, Aufwendungsersatz der Nachbarin Krumm für die Notmaßnahme vom 05.12.2025, Brandschaden vom 19.12.2025 nebst Deliktshaftung sowie Regress der Provinzial Nord. Für jedes Thema wird getrennt gefragt, ob es bereits entscheidungsreif ist, ob weitere Tatsachen fehlen oder ob zunächst nur ein Risikovermerk möglich ist.</w:t>
       </w:r>
     </w:p>
     <w:p>
@@ -76,7 +67,7 @@
         <w:jc w:val="left"/>
       </w:pPr>
       <w:r>
-        <w:t>Die bisherige Akte enthält mehrere Beweistypen. Verwertbar sind Originaldokumente, unterschriebene Entwürfe, Bescheide, Registerauszüge, Vertragsfassungen, Fristnotizen und E-Mails mit erkennbarem Absender. Nur eingeschränkt verwertbar sind spätere Zusammenfassungen, Screenshots ohne Kontext, Gesprächsnotizen ohne Datum und bloße Erinnerungen. Deshalb ist jede rechtliche Schlussfolgerung in diesem Gutachten mit einem Beweistyp verknüpft.</w:t>
+        <w:t>Die Akte enthält mehrere Beweistypen. Verwertbar sind das Angebot Nr. 25-1188 vom 14.10.2025, die Bestell-E-Mail der Mandantin vom 18.10.2025 mit dem Zusatz, sie wolle im Winter 2025/26 sicher heizen können, die Bürgschaftsurkunde der Bankhaus Nordtor eG vom 20.10.2025, das Montageprotokoll vom 21.11.2025, die Mängel-E-Mail vom 03.12.2025 sowie die Belege der Nachbarin Krumm über 286 EUR, 49 EUR und 65 EUR. Nur eingeschränkt verwertbar sind die lediglich beschriebenen Fotos ohne gesicherte Metadaten, der Screenshot der Temperaturanzeige mit 51 Grad Vorlauf und die mündliche Schilderung des Probebetriebs von 17 Minuten. Deshalb ist jede rechtliche Schlussfolgerung in diesem Gutachten mit einem Beweistyp verknüpft.</w:t>
       </w:r>
     </w:p>
     <w:p>
@@ -84,7 +75,7 @@
         <w:jc w:val="left"/>
       </w:pPr>
       <w:r>
-        <w:t>Der wichtigste Fehler wäre, den Fall schon deshalb als geklärt anzusehen, weil ein Dokument einen prägnanten Titel trägt. Ein Dokument mit der Überschrift „Final“ kann rechtlich unverbindlich sein. Ein E-Mail-Anhang kann überholt sein. Ein Protokoll kann inhaltlich falsch wiedergeben, was beschlossen wurde. Deshalb wird zunächst eine Beweismatrix geführt.</w:t>
+        <w:t>Der wichtigste Fehler wäre, den Fall wegen des angekreuzten Abnahmefeldes im Montageprotokoll vom 21.11.2025 als geklärt anzusehen. Die Unterschrift ist unleserlich, und die Mandantin erklärt, sie habe nur unterschrieben, damit der Monteur endlich loskomme; eine Billigung des Werks als im Wesentlichen vertragsgemäß im Sinne des § 640 Abs. 1 BGB ist damit nicht belegt. Ebenso wenig trägt der Protokolleintrag, die Rauchentwicklung sei „leicht, normal bei Erstbrand“, eine Aussage über die Mangelfreiheit. Deshalb wird zunächst eine Beweismatrix geführt.</w:t>
       </w:r>
     </w:p>
     <w:p>
@@ -103,7 +94,7 @@
         <w:jc w:val="left"/>
       </w:pPr>
       <w:r>
-        <w:t>Die Hauptfrage ist nicht, ob das gewünschte Ergebnis wirtschaftlich sinnvoll wäre. Die Hauptfrage lautet, ob die konkrete Handlung auf der vorhandenen Tatsachengrundlage rechtlich trägt. Dafür müssen Zuständigkeit, Form, Frist, materielle Voraussetzungen, Ermessen beziehungsweise Bewertungsspielraum, Dokumentation und Rechtsfolge einzeln geprüft werden.</w:t>
+        <w:t>Die Hauptfrage ist nicht, ob die Mandantin den Ofen wirtschaftlich behalten möchte. Die Hauptfrage lautet, ob die Schlussrate von 3.400 EUR nach § 641 Abs. 1 BGB fällig ist, obwohl eine rechtliche Abnahme bestritten wird, ob die Mängelrechte aus §§ 634 ff. BGB wegen Rauch, Wasseraustritt und Minderleistung durchgreifen und ob die Bankhaus Nordtor eG der Inanspruchnahme durch Ofenhaus vom 12.01.2026 die Einreden aus §§ 768, 770 BGB entgegenhalten kann. Dafür sind Vertragstyp, Abnahme, Mängelanzeige, Fristsetzung, Beweislast und Rechtsfolge einzeln zu prüfen.</w:t>
       </w:r>
     </w:p>
     <w:p>
@@ -111,7 +102,7 @@
         <w:jc w:val="left"/>
       </w:pPr>
       <w:r>
-        <w:t>Bei der Prüfung darf die Bearbeitung nicht in eine bloße Checkliste abrutschen. Gerade in dieser Akte hängen mehrere Teilfragen voneinander ab. Eine formal richtige Erklärung kann wertlos sein, wenn sie an die falsche Stelle gerichtet ist. Eine materiell gute Position kann verloren gehen, wenn sie zu spät oder ohne Beleg vorgebracht wird. Eine taktisch attraktive Offenlegung kann schaden, wenn sie ohne Not interne Bewertungen preisgibt.</w:t>
+        <w:t>Bei der Prüfung darf die Bearbeitung nicht in eine bloße Checkliste abrutschen, weil die Teilfragen voneinander abhängen. Ohne Abnahme keine Fälligkeit der Schlussrate, ohne fällige Hauptschuld keine berechtigte Inanspruchnahme der Bürgschaft; zugleich würde eine wirksame Abnahme die Beweislast für die Mängel auf die Mandantin verlagern. Die AGB-Klausel, die die Gewährleistung auf Nachbesserung beschränkt und Rücktritt sowie Schadensersatz ausschließt, dürfte nach §§ 307, 309 Nr. 8 BGB unwirksam sein, darf aber im Außenschreiben nicht vorschnell als erledigt behandelt werden. Und die Zahlung von 300 EUR auf den nicht unterschriebenen Nachtrag vom 30.11.2025 kann schaden, wenn die Gegenseite sie als Vertragsannahme oder Anerkenntnis deutet.</w:t>
       </w:r>
     </w:p>
     <w:p>
@@ -130,7 +121,7 @@
         <w:jc w:val="left"/>
       </w:pPr>
       <w:r>
-        <w:t>Nach dem derzeitigen Stand spricht vieles dafür, dass mindestens ein rechtlicher Angriffspunkt besteht. Zugleich ist die Verteidigungslinie nicht fertig. Die stärkste Position ergibt sich aus den Unterlagen, die schon vor dem Konflikt entstanden sind. Schwächer sind Dokumente, die erkennbar erst nach dem Streit formuliert wurden.</w:t>
+        <w:t>Nach dem derzeitigen Stand spricht vieles dafür, dass mindestens ein Mängelrecht besteht: Rauchgeruch im Treppenhaus, Wasseraustritt aus der Rücklaufleitung, ein Vorlauf von nur 51 Grad bei voller Befeuerung und der etwa 18 cm breite Rußkranz am Wanddurchbruch wurden bereits am 03.12.2025, also binnen zwei Wochen nach der Montage, angezeigt. Die stärkste Position ergibt sich aus den vor dem Konflikt entstandenen Unterlagen: Angebot, Bestell-E-Mail mit der Bedingung sicheren Heizens im Winter 2025/26 und Herstelleranleitung mit Mindestabstand von 40 cm und Manschettenpflicht. Schwächer sind Einschätzungen, die erst nach dem Brand vom 19.12.2025 formuliert wurden.</w:t>
       </w:r>
     </w:p>
     <w:p>
@@ -146,13 +137,7 @@
         <w:pStyle w:val="ListBullet"/>
       </w:pPr>
       <w:r>
-        <w:rPr>
-          <w:b/>
-        </w:rPr>
-        <w:t>sichere Tatsachen:</w:t>
-      </w:r>
-      <w:r>
-        <w:t xml:space="preserve"> Datum, Beteiligte, vorhandene Originale, Zugang, sichtbarer Inhalt;</w:t>
+        <w:t>sichere Tatsachen: Angebot Nr. 25-1188 vom 14.10.2025, Bestellung vom 18.10.2025, Bürgschaftsurkunde vom 20.10.2025 über höchstens 4.000 EUR, Mängel-E-Mail vom 03.12.2025, Inanspruchnahmeschreiben der Ofenhaus Backstein GmbH an die Bank vom 12.01.2026;</w:t>
       </w:r>
     </w:p>
     <w:p>
@@ -160,13 +145,7 @@
         <w:pStyle w:val="ListBullet"/>
       </w:pPr>
       <w:r>
-        <w:rPr>
-          <w:b/>
-        </w:rPr>
-        <w:t>plausible, aber offene Tatsachen:</w:t>
-      </w:r>
-      <w:r>
-        <w:t xml:space="preserve"> interne Freigabe, Gesprächsinhalt, wirtschaftlicher Zweck, tatsächliche Kenntnis;</w:t>
+        <w:t>plausible, aber offene Tatsachen: Ursache von Rauchentwicklung, Wasseraustritt und Brand, fachgerechte Montage der Brandschutzmanschette, tatsächliche Einhaltung des Mindestabstands von 40 cm, Inhalt der Einweisung beim Probebetrieb von 17 Minuten;</w:t>
       </w:r>
     </w:p>
     <w:p>
@@ -174,13 +153,7 @@
         <w:pStyle w:val="ListBullet"/>
       </w:pPr>
       <w:r>
-        <w:rPr>
-          <w:b/>
-        </w:rPr>
-        <w:t>bloße Bewertungen:</w:t>
-      </w:r>
-      <w:r>
-        <w:t xml:space="preserve"> „üblich“, „unproblematisch“, „nur Formalie“, „hatten wir immer so gemacht“.</w:t>
+        <w:t>bloße Bewertungen: „leicht, normal bei Erstbrand“, „nach Augenschein dicht“, „eigenmächtig Panik gemacht“, „altes Schornsteinmauerwerk“.</w:t>
       </w:r>
     </w:p>
     <w:p>
@@ -188,7 +161,7 @@
         <w:jc w:val="left"/>
       </w:pPr>
       <w:r>
-        <w:t>Nur die erste Ebene darf ohne Einschränkung in ein Außenschreiben. Die zweite Ebene kann als Prüfstand dargestellt werden. Die dritte Ebene gehört in die interne Risikodiskussion, nicht in die externe Einlassung.</w:t>
+        <w:t>Nur die erste Ebene darf ohne Einschränkung in das Antwortschreiben an die Ofenhaus Backstein GmbH. Die zweite Ebene wird als offener Prüfstand dargestellt und den Sachverständigenfragen zu Montage, Wanddurchbruch und Hydraulik zugewiesen. Die dritte Ebene gehört in die interne Risikodiskussion, nicht in die Einlassung gegenüber Ofenhaus, Bankhaus Nordtor eG oder Provinzial Nord.</w:t>
       </w:r>
     </w:p>
     <w:p>
@@ -207,7 +180,7 @@
         <w:jc w:val="left"/>
       </w:pPr>
       <w:r>
-        <w:t>Die Gegenseite wird voraussichtlich nicht nur einen Einzelfehler behaupten, sondern ein Organisationsdefizit. Sie wird sagen, die Mandantenseite habe nicht dokumentiert, nicht rechtzeitig geprüft oder die rechtliche Einordnung bewusst offengelassen. Diese Gegenposition ist ernst zu nehmen, weil sie oft weniger am einzelnen Dokument als an der Gesamterscheinung der Akte ansetzt.</w:t>
+        <w:t>Die Ofenhaus Backstein GmbH wird voraussichtlich nicht nur einen Einzelfehler bestreiten, sondern die Verantwortung insgesamt von sich weisen: Die Mandantin habe die Leistung am 21.11.2025 abgenommen, die Symptome beruhten auf unsachgemäßem Betrieb und auf Eingriffen Dritter — gemeint ist die Notabschaltung durch die Nachbarin Krumm am 05.12.2025 —, und der Brand vom 19.12.2025 gehe auf das alte Schornsteinmauerwerk zurück. Zudem beruft sie sich auf ihre AGB, wonach die Montage durch selbstständige Fachpartner erfolgt und für Schäden an Bestandsleitungen nicht gehaftet wird.</w:t>
       </w:r>
     </w:p>
     <w:p>
@@ -215,7 +188,7 @@
         <w:jc w:val="left"/>
       </w:pPr>
       <w:r>
-        <w:t>Dagegen hilft keine schroffe Abwehrformel. Besser ist eine nüchterne Darstellung: Was ist belegt? Was wird geprüft? Was wurde korrigiert? Was wird bestritten? Welche rechtliche Wertung bleibt vorbehalten?</w:t>
+        <w:t>Dagegen hilft keine schroffe Abwehrformel. Besser ist eine nüchterne Darstellung: Belegt sind die Mängelanzeige vom 03.12.2025 und die frühen Symptome vor jedem Fremdeingriff; geprüft wird die Brandursache durch Sachverständigenbeweis; bestritten wird eine rechtliche Abnahme; vorbehalten bleibt die Inhaltskontrolle der AGB-Haftungsausschlüsse nach §§ 305c, 307 BGB.</w:t>
       </w:r>
     </w:p>
     <w:p>
@@ -242,7 +215,7 @@
         <w:pStyle w:val="ListNumber"/>
       </w:pPr>
       <w:r>
-        <w:t>Originalunterlagen sichern und nummerieren.</w:t>
+        <w:t>Ofen, Rücklaufleitung und Wanddurchbruch unverändert lassen und den Zustand mit datierten Fotos sichern.</w:t>
       </w:r>
     </w:p>
     <w:p>
@@ -250,7 +223,7 @@
         <w:pStyle w:val="ListNumber"/>
       </w:pPr>
       <w:r>
-        <w:t>Fristenkalender mit Verantwortlichkeit erstellen.</w:t>
+        <w:t>Fristenkalender führen: Bestätigungsfrist gegenüber Ofenhaus zum 26.05.2026, Verjährung der Mängelrechte nach § 634a BGB, Antwort auf die Unterlagenanforderung der Provinzial Nord vom 06.02.2026.</w:t>
       </w:r>
     </w:p>
     <w:p>
@@ -258,7 +231,7 @@
         <w:pStyle w:val="ListNumber"/>
       </w:pPr>
       <w:r>
-        <w:t>Eine kurze Außenantwort vorbereiten, die Eingang bestätigt und Prüfstand strukturiert.</w:t>
+        <w:t>Das Antwortschreiben an Ofenhaus absenden: Zurückweisung der Schlussrate, Fristsetzung zur Nacherfüllung nach § 635 BGB, Aufforderung, die Bürgschaft der Bankhaus Nordtor eG nicht weiter zu ziehen.</w:t>
       </w:r>
     </w:p>
     <w:p>
@@ -266,7 +239,7 @@
         <w:pStyle w:val="ListNumber"/>
       </w:pPr>
       <w:r>
-        <w:t>Intern ein Langmemo mit Risikoampel führen.</w:t>
+        <w:t>Intern ein Langmemo mit Risikoampel zu Abnahme, AGB-Wirksamkeit, Bürgschaftseinreden, GoA-Kosten der Nachbarin Krumm und Deliktsregress führen.</w:t>
       </w:r>
     </w:p>
     <w:p>
@@ -274,7 +247,7 @@
         <w:pStyle w:val="ListNumber"/>
       </w:pPr>
       <w:r>
-        <w:t>Nach Aktenvervollständigung eine endgültige Stellungnahme verfassen.</w:t>
+        <w:t>Nach Eingang der vollständigen Herstelleranleitung, des Inbetriebnahmeblatts und der Schornsteinfegerunterlagen die endgültige Stellungnahme verfassen.</w:t>
       </w:r>
     </w:p>
     <w:p>
@@ -282,7 +255,7 @@
         <w:pStyle w:val="ListNumber"/>
       </w:pPr>
       <w:r>
-        <w:t>Bei Vergleichs- oder Behördenkontakt nur vorher freigegebene Tatsachen verwenden.</w:t>
+        <w:t>Gegenüber Bank, Versicherer und Ofenhaus nur zuvor freigegebene Tatsachen der ersten Ebene verwenden.</w:t>
       </w:r>
     </w:p>
     <w:p>
@@ -301,13 +274,7 @@
         <w:jc w:val="left"/>
       </w:pPr>
       <w:r>
-        <w:rPr>
-          <w:b/>
-        </w:rPr>
-        <w:t>Option A: defensive Minimalantwort.</w:t>
-      </w:r>
-      <w:r>
-        <w:t xml:space="preserve"> Vorteil: geringe Selbstbelastung, schnelle Fristwahrung. Nachteil: wirkt ausweichend, wenn die Gegenseite konkrete Belege erwartet.</w:t>
+        <w:t>Option A: bloße Zurückweisung der Schlussrate ohne Begründung in der Sache. Vorteil: geringe Selbstbindung, schnelle Fristwahrung. Nachteil: wirkt ausweichend, weil Ofenhaus die Bürgschaft bereits am 12.01.2026 in Anspruch genommen hat und die Bank konkrete Belege für die Einreden erwartet.</w:t>
       </w:r>
     </w:p>
     <w:p>
@@ -315,13 +282,7 @@
         <w:jc w:val="left"/>
       </w:pPr>
       <w:r>
-        <w:rPr>
-          <w:b/>
-        </w:rPr>
-        <w:t>Option B: strukturierte Teiloffenlegung.</w:t>
-      </w:r>
-      <w:r>
-        <w:t xml:space="preserve"> Vorteil: glaubwürdig und kooperativ, ohne die Rechtsposition aufzugeben. Nachteil: benötigt saubere interne Abstimmung.</w:t>
+        <w:t>Option B: strukturierte Teiloffenlegung mit Mängelchronologie ab dem 03.12.2025, Fristsetzung zur Nacherfüllung und Aufforderung, die Bürgschaftsinanspruchnahme nicht weiterzuverfolgen. Vorteil: glaubwürdig gegenüber Bank und Versicherer, ohne die Position zur fehlenden Abnahme aufzugeben. Nachteil: erfordert saubere Abstimmung mit der Provinzial Nord wegen des Regressvorbehalts.</w:t>
       </w:r>
     </w:p>
     <w:p>
@@ -329,13 +290,7 @@
         <w:jc w:val="left"/>
       </w:pPr>
       <w:r>
-        <w:rPr>
-          <w:b/>
-        </w:rPr>
-        <w:t>Option C: umfassende Stellungnahme.</w:t>
-      </w:r>
-      <w:r>
-        <w:t xml:space="preserve"> Vorteil: kann Verfahren beenden oder Vertrauen herstellen. Nachteil: hohes Risiko, wenn Unterlagen noch Lücken haben.</w:t>
+        <w:t>Option C: sofortige negative Feststellungsklage zum Landgericht Lübeck nebst einstweiligem Rechtsschutz gegen die Bürgschaftsinanspruchnahme. Vorteil: maximaler Druck auf Ofenhaus und Bank. Nachteil: hohes Kostenrisiko, solange die Brandursache nicht durch Sachverständigenbeweis gesichert ist.</w:t>
       </w:r>
     </w:p>
     <w:p>
@@ -343,7 +298,7 @@
         <w:jc w:val="left"/>
       </w:pPr>
       <w:r>
-        <w:t>Derzeit ist Option B vorzugswürdig. Sie erlaubt Kontrolle über die Erzählung, vermeidet unnötige Anerkenntnisse und zwingt die Akte in eine belastbare Ordnung.</w:t>
+        <w:t>Derzeit ist Option B vorzugswürdig. Sie erlaubt Kontrolle über die Darstellung gegenüber Bankhaus Nordtor eG und Provinzial Nord, vermeidet ein Anerkenntnis der Abnahme und zwingt die Akte vor einer Klage in eine belastbare Ordnung.</w:t>
       </w:r>
     </w:p>
     <w:p>
@@ -362,7 +317,7 @@
         <w:pStyle w:val="ListBullet"/>
       </w:pPr>
       <w:r>
-        <w:t>finale Vertrags-/Bescheid-/Beschlussfassung mit Datum;</w:t>
+        <w:t>vollständige Herstelleranleitung des Aquaflamm 8 kW einschließlich der Hydraulikschemata A und B;</w:t>
       </w:r>
     </w:p>
     <w:p>
@@ -370,7 +325,7 @@
         <w:pStyle w:val="ListBullet"/>
       </w:pPr>
       <w:r>
-        <w:t>Zugangsnachweis;</w:t>
+        <w:t>unterschriebenes Inbetriebnahmeblatt nach Herstellerformular;</w:t>
       </w:r>
     </w:p>
     <w:p>
@@ -378,7 +333,7 @@
         <w:pStyle w:val="ListBullet"/>
       </w:pPr>
       <w:r>
-        <w:t>Liste der entscheidungsbefugten Personen;</w:t>
+        <w:t>Original des Montageprotokolls vom 21.11.2025 zur Klärung der unleserlichen Unterschrift;</w:t>
       </w:r>
     </w:p>
     <w:p>
@@ -386,7 +341,7 @@
         <w:pStyle w:val="ListBullet"/>
       </w:pPr>
       <w:r>
-        <w:t>interne Freigabehistorie;</w:t>
+        <w:t>Nachweis, ob die Mandantin eine Bürgschaftsprovision gezahlt hat und ob die Bank in den Nachtrag vom 30.11.2025 einbezogen wurde;</w:t>
       </w:r>
     </w:p>
     <w:p>
@@ -394,7 +349,7 @@
         <w:pStyle w:val="ListBullet"/>
       </w:pPr>
       <w:r>
-        <w:t>Zahlenbasis;</w:t>
+        <w:t>Regulierungsabrechnung der Provinzial Nord über die vorläufig gezahlten 18.600 EUR;</w:t>
       </w:r>
     </w:p>
     <w:p>
@@ -402,7 +357,7 @@
         <w:pStyle w:val="ListBullet"/>
       </w:pPr>
       <w:r>
-        <w:t>technische oder fachliche Anlage;</w:t>
+        <w:t>Unterlagen des Bezirksschornsteinfegers zur erst nachträglichen Anzeige der Anlage;</w:t>
       </w:r>
     </w:p>
     <w:p>
@@ -410,7 +365,7 @@
         <w:pStyle w:val="ListBullet"/>
       </w:pPr>
       <w:r>
-        <w:t>Nachweis, ob eine frühere Fassung abgelöst wurde.</w:t>
+        <w:t>Belege der Nachbarin Krumm über Schlüsseldienst (286 EUR), Installateur-Telefonpauschale (49 EUR) und Reinigung des Hausflurs (65 EUR).</w:t>
       </w:r>
     </w:p>
     <w:p>
@@ -429,7 +384,7 @@
         <w:jc w:val="left"/>
       </w:pPr>
       <w:r>
-        <w:t>Die Akte ist bearbeitbar, aber noch nicht entscheidungsreif. Ein juristisch guter nächster Schritt ist eine knappe, kontrollierte Außenkommunikation und parallel eine harte interne Beweisordnung. Erst danach sollte die endgültige rechtliche Bewertung ausgegeben werden.</w:t>
+        <w:t>Die Akte ist bearbeitbar, aber noch nicht entscheidungsreif. Der juristisch richtige nächste Schritt ist das kontrollierte Antwortschreiben an die Ofenhaus Backstein GmbH nach Option B, verbunden mit der Information der Bankhaus Nordtor eG über die Einreden aus §§ 768, 770 BGB und einer strengen internen Beweisordnung. Erst nach dem Sachverständigengutachten zur Brandursache sollte über Klage oder einen Vergleich auf der Linie des vorliegenden Entwurfs (Nachbesserung bis 30.06.2026, Reduzierung der Schlussrate auf 1.450 EUR, Rückgabe der Bürgschaftsurkunde) entschieden werden.</w:t>
       </w:r>
     </w:p>
     <w:sectPr>

</xml_diff>